<commit_message>
ML:A3 封面授課教師改為「Li Guan, Chunping Li」
Co-Authored-By: Claude Opus 5.5 <noreply@anthropic.com>
</commit_message>
<xml_diff>
--- a/Machine Learning/assessments/A3_交件/Huang_26254793_321513_A3.docx
+++ b/Machine Learning/assessments/A3_交件/Huang_26254793_321513_A3.docx
@@ -427,25 +427,7 @@
               <w:rPr>
                 <w:sz w:val="22"/>
               </w:rPr>
-              <w:t>Dr Li Guan</w:t>
-            </w:r>
-            <w:r>
-              <w:rPr>
-                <w:sz w:val="22"/>
-              </w:rPr>
-              <w:t>、</w:t>
-            </w:r>
-            <w:r>
-              <w:rPr>
-                <w:sz w:val="22"/>
-              </w:rPr>
-              <w:t>Chunping Li</w:t>
-            </w:r>
-            <w:r>
-              <w:rPr>
-                <w:sz w:val="22"/>
-              </w:rPr>
-              <w:t>（線上學習講師）</w:t>
+              <w:t>Li Guan, Chunping Li</w:t>
             </w:r>
           </w:p>
         </w:tc>
@@ -620,7 +602,7 @@
       <w:r>
         <w:fldChar w:fldCharType="separate"/>
       </w:r>
-      <w:hyperlink w:anchor="_Toc242536591" w:history="1">
+      <w:hyperlink w:anchor="_Toc242536657" w:history="1">
         <w:r>
           <w:rPr>
             <w:rStyle w:val="affa"/>
@@ -654,7 +636,7 @@
             <w:noProof/>
             <w:webHidden/>
           </w:rPr>
-          <w:instrText xml:space="preserve"> PAGEREF _Toc242536591 \h </w:instrText>
+          <w:instrText xml:space="preserve"> PAGEREF _Toc242536657 \h </w:instrText>
         </w:r>
         <w:r>
           <w:rPr>
@@ -695,7 +677,7 @@
           <w:noProof/>
         </w:rPr>
       </w:pPr>
-      <w:hyperlink w:anchor="_Toc242536592" w:history="1">
+      <w:hyperlink w:anchor="_Toc242536658" w:history="1">
         <w:r>
           <w:rPr>
             <w:rStyle w:val="affa"/>
@@ -743,7 +725,7 @@
             <w:noProof/>
             <w:webHidden/>
           </w:rPr>
-          <w:instrText xml:space="preserve"> PAGEREF _Toc242536592 \h </w:instrText>
+          <w:instrText xml:space="preserve"> PAGEREF _Toc242536658 \h </w:instrText>
         </w:r>
         <w:r>
           <w:rPr>
@@ -784,7 +766,7 @@
           <w:noProof/>
         </w:rPr>
       </w:pPr>
-      <w:hyperlink w:anchor="_Toc242536593" w:history="1">
+      <w:hyperlink w:anchor="_Toc242536659" w:history="1">
         <w:r>
           <w:rPr>
             <w:rStyle w:val="affa"/>
@@ -832,7 +814,7 @@
             <w:noProof/>
             <w:webHidden/>
           </w:rPr>
-          <w:instrText xml:space="preserve"> PAGEREF _Toc242536593 \h </w:instrText>
+          <w:instrText xml:space="preserve"> PAGEREF _Toc242536659 \h </w:instrText>
         </w:r>
         <w:r>
           <w:rPr>
@@ -873,7 +855,7 @@
           <w:noProof/>
         </w:rPr>
       </w:pPr>
-      <w:hyperlink w:anchor="_Toc242536594" w:history="1">
+      <w:hyperlink w:anchor="_Toc242536660" w:history="1">
         <w:r>
           <w:rPr>
             <w:rStyle w:val="affa"/>
@@ -907,7 +889,7 @@
             <w:noProof/>
             <w:webHidden/>
           </w:rPr>
-          <w:instrText xml:space="preserve"> PAGEREF _Toc242536594 \h </w:instrText>
+          <w:instrText xml:space="preserve"> PAGEREF _Toc242536660 \h </w:instrText>
         </w:r>
         <w:r>
           <w:rPr>
@@ -948,7 +930,7 @@
           <w:noProof/>
         </w:rPr>
       </w:pPr>
-      <w:hyperlink w:anchor="_Toc242536595" w:history="1">
+      <w:hyperlink w:anchor="_Toc242536661" w:history="1">
         <w:r>
           <w:rPr>
             <w:rStyle w:val="affa"/>
@@ -982,7 +964,7 @@
             <w:noProof/>
             <w:webHidden/>
           </w:rPr>
-          <w:instrText xml:space="preserve"> PAGEREF _Toc242536595 \h </w:instrText>
+          <w:instrText xml:space="preserve"> PAGEREF _Toc242536661 \h </w:instrText>
         </w:r>
         <w:r>
           <w:rPr>
@@ -1023,7 +1005,7 @@
           <w:noProof/>
         </w:rPr>
       </w:pPr>
-      <w:hyperlink w:anchor="_Toc242536596" w:history="1">
+      <w:hyperlink w:anchor="_Toc242536662" w:history="1">
         <w:r>
           <w:rPr>
             <w:rStyle w:val="affa"/>
@@ -1071,7 +1053,7 @@
             <w:noProof/>
             <w:webHidden/>
           </w:rPr>
-          <w:instrText xml:space="preserve"> PAGEREF _Toc242536596 \h </w:instrText>
+          <w:instrText xml:space="preserve"> PAGEREF _Toc242536662 \h </w:instrText>
         </w:r>
         <w:r>
           <w:rPr>
@@ -1112,7 +1094,7 @@
           <w:noProof/>
         </w:rPr>
       </w:pPr>
-      <w:hyperlink w:anchor="_Toc242536597" w:history="1">
+      <w:hyperlink w:anchor="_Toc242536663" w:history="1">
         <w:r>
           <w:rPr>
             <w:rStyle w:val="affa"/>
@@ -1146,7 +1128,7 @@
             <w:noProof/>
             <w:webHidden/>
           </w:rPr>
-          <w:instrText xml:space="preserve"> PAGEREF _Toc242536597 \h </w:instrText>
+          <w:instrText xml:space="preserve"> PAGEREF _Toc242536663 \h </w:instrText>
         </w:r>
         <w:r>
           <w:rPr>
@@ -1187,7 +1169,7 @@
           <w:noProof/>
         </w:rPr>
       </w:pPr>
-      <w:hyperlink w:anchor="_Toc242536598" w:history="1">
+      <w:hyperlink w:anchor="_Toc242536664" w:history="1">
         <w:r>
           <w:rPr>
             <w:rStyle w:val="affa"/>
@@ -1221,7 +1203,7 @@
             <w:noProof/>
             <w:webHidden/>
           </w:rPr>
-          <w:instrText xml:space="preserve"> PAGEREF _Toc242536598 \h </w:instrText>
+          <w:instrText xml:space="preserve"> PAGEREF _Toc242536664 \h </w:instrText>
         </w:r>
         <w:r>
           <w:rPr>
@@ -1262,7 +1244,7 @@
           <w:noProof/>
         </w:rPr>
       </w:pPr>
-      <w:hyperlink w:anchor="_Toc242536599" w:history="1">
+      <w:hyperlink w:anchor="_Toc242536665" w:history="1">
         <w:r>
           <w:rPr>
             <w:rStyle w:val="affa"/>
@@ -1296,7 +1278,7 @@
             <w:noProof/>
             <w:webHidden/>
           </w:rPr>
-          <w:instrText xml:space="preserve"> PAGEREF _Toc242536599 \h </w:instrText>
+          <w:instrText xml:space="preserve"> PAGEREF _Toc242536665 \h </w:instrText>
         </w:r>
         <w:r>
           <w:rPr>
@@ -1337,7 +1319,7 @@
           <w:noProof/>
         </w:rPr>
       </w:pPr>
-      <w:hyperlink w:anchor="_Toc242536600" w:history="1">
+      <w:hyperlink w:anchor="_Toc242536666" w:history="1">
         <w:r>
           <w:rPr>
             <w:rStyle w:val="affa"/>
@@ -1371,7 +1353,7 @@
             <w:noProof/>
             <w:webHidden/>
           </w:rPr>
-          <w:instrText xml:space="preserve"> PAGEREF _Toc242536600 \h </w:instrText>
+          <w:instrText xml:space="preserve"> PAGEREF _Toc242536666 \h </w:instrText>
         </w:r>
         <w:r>
           <w:rPr>
@@ -1412,7 +1394,7 @@
           <w:noProof/>
         </w:rPr>
       </w:pPr>
-      <w:hyperlink w:anchor="_Toc242536601" w:history="1">
+      <w:hyperlink w:anchor="_Toc242536667" w:history="1">
         <w:r>
           <w:rPr>
             <w:rStyle w:val="affa"/>
@@ -1460,7 +1442,7 @@
             <w:noProof/>
             <w:webHidden/>
           </w:rPr>
-          <w:instrText xml:space="preserve"> PAGEREF _Toc242536601 \h </w:instrText>
+          <w:instrText xml:space="preserve"> PAGEREF _Toc242536667 \h </w:instrText>
         </w:r>
         <w:r>
           <w:rPr>
@@ -1501,7 +1483,7 @@
           <w:noProof/>
         </w:rPr>
       </w:pPr>
-      <w:hyperlink w:anchor="_Toc242536602" w:history="1">
+      <w:hyperlink w:anchor="_Toc242536668" w:history="1">
         <w:r>
           <w:rPr>
             <w:rStyle w:val="affa"/>
@@ -1549,7 +1531,7 @@
             <w:noProof/>
             <w:webHidden/>
           </w:rPr>
-          <w:instrText xml:space="preserve"> PAGEREF _Toc242536602 \h </w:instrText>
+          <w:instrText xml:space="preserve"> PAGEREF _Toc242536668 \h </w:instrText>
         </w:r>
         <w:r>
           <w:rPr>
@@ -1590,7 +1572,7 @@
           <w:noProof/>
         </w:rPr>
       </w:pPr>
-      <w:hyperlink w:anchor="_Toc242536603" w:history="1">
+      <w:hyperlink w:anchor="_Toc242536669" w:history="1">
         <w:r>
           <w:rPr>
             <w:rStyle w:val="affa"/>
@@ -1624,7 +1606,7 @@
             <w:noProof/>
             <w:webHidden/>
           </w:rPr>
-          <w:instrText xml:space="preserve"> PAGEREF _Toc242536603 \h </w:instrText>
+          <w:instrText xml:space="preserve"> PAGEREF _Toc242536669 \h </w:instrText>
         </w:r>
         <w:r>
           <w:rPr>
@@ -1665,7 +1647,7 @@
           <w:noProof/>
         </w:rPr>
       </w:pPr>
-      <w:hyperlink w:anchor="_Toc242536604" w:history="1">
+      <w:hyperlink w:anchor="_Toc242536670" w:history="1">
         <w:r>
           <w:rPr>
             <w:rStyle w:val="affa"/>
@@ -1699,7 +1681,7 @@
             <w:noProof/>
             <w:webHidden/>
           </w:rPr>
-          <w:instrText xml:space="preserve"> PAGEREF _Toc242536604 \h </w:instrText>
+          <w:instrText xml:space="preserve"> PAGEREF _Toc242536670 \h </w:instrText>
         </w:r>
         <w:r>
           <w:rPr>
@@ -1740,7 +1722,7 @@
           <w:noProof/>
         </w:rPr>
       </w:pPr>
-      <w:hyperlink w:anchor="_Toc242536605" w:history="1">
+      <w:hyperlink w:anchor="_Toc242536671" w:history="1">
         <w:r>
           <w:rPr>
             <w:rStyle w:val="affa"/>
@@ -1774,7 +1756,7 @@
             <w:noProof/>
             <w:webHidden/>
           </w:rPr>
-          <w:instrText xml:space="preserve"> PAGEREF _Toc242536605 \h </w:instrText>
+          <w:instrText xml:space="preserve"> PAGEREF _Toc242536671 \h </w:instrText>
         </w:r>
         <w:r>
           <w:rPr>
@@ -1815,7 +1797,7 @@
           <w:noProof/>
         </w:rPr>
       </w:pPr>
-      <w:hyperlink w:anchor="_Toc242536606" w:history="1">
+      <w:hyperlink w:anchor="_Toc242536672" w:history="1">
         <w:r>
           <w:rPr>
             <w:rStyle w:val="affa"/>
@@ -1842,7 +1824,7 @@
             <w:noProof/>
             <w:webHidden/>
           </w:rPr>
-          <w:instrText xml:space="preserve"> PAGEREF _Toc242536606 \h </w:instrText>
+          <w:instrText xml:space="preserve"> PAGEREF _Toc242536672 \h </w:instrText>
         </w:r>
         <w:r>
           <w:rPr>
@@ -1883,7 +1865,7 @@
           <w:noProof/>
         </w:rPr>
       </w:pPr>
-      <w:hyperlink w:anchor="_Toc242536607" w:history="1">
+      <w:hyperlink w:anchor="_Toc242536673" w:history="1">
         <w:r>
           <w:rPr>
             <w:rStyle w:val="affa"/>
@@ -1910,7 +1892,7 @@
             <w:noProof/>
             <w:webHidden/>
           </w:rPr>
-          <w:instrText xml:space="preserve"> PAGEREF _Toc242536607 \h </w:instrText>
+          <w:instrText xml:space="preserve"> PAGEREF _Toc242536673 \h </w:instrText>
         </w:r>
         <w:r>
           <w:rPr>
@@ -1951,7 +1933,7 @@
           <w:noProof/>
         </w:rPr>
       </w:pPr>
-      <w:hyperlink w:anchor="_Toc242536608" w:history="1">
+      <w:hyperlink w:anchor="_Toc242536674" w:history="1">
         <w:r>
           <w:rPr>
             <w:rStyle w:val="affa"/>
@@ -1992,7 +1974,7 @@
             <w:noProof/>
             <w:webHidden/>
           </w:rPr>
-          <w:instrText xml:space="preserve"> PAGEREF _Toc242536608 \h </w:instrText>
+          <w:instrText xml:space="preserve"> PAGEREF _Toc242536674 \h </w:instrText>
         </w:r>
         <w:r>
           <w:rPr>
@@ -2033,7 +2015,7 @@
           <w:noProof/>
         </w:rPr>
       </w:pPr>
-      <w:hyperlink w:anchor="_Toc242536609" w:history="1">
+      <w:hyperlink w:anchor="_Toc242536675" w:history="1">
         <w:r>
           <w:rPr>
             <w:rStyle w:val="affa"/>
@@ -2074,7 +2056,7 @@
             <w:noProof/>
             <w:webHidden/>
           </w:rPr>
-          <w:instrText xml:space="preserve"> PAGEREF _Toc242536609 \h </w:instrText>
+          <w:instrText xml:space="preserve"> PAGEREF _Toc242536675 \h </w:instrText>
         </w:r>
         <w:r>
           <w:rPr>
@@ -2119,7 +2101,7 @@
       <w:pPr>
         <w:pStyle w:val="1"/>
       </w:pPr>
-      <w:bookmarkStart w:id="0" w:name="_Toc242536591"/>
+      <w:bookmarkStart w:id="0" w:name="_Toc242536657"/>
       <w:r>
         <w:rPr>
           <w:rFonts w:ascii="Times New Roman" w:eastAsia="新細明體" w:hAnsi="Times New Roman" w:cs="Times New Roman"/>
@@ -4852,7 +4834,7 @@
       <w:pPr>
         <w:pStyle w:val="1"/>
       </w:pPr>
-      <w:bookmarkStart w:id="1" w:name="_Toc242536592"/>
+      <w:bookmarkStart w:id="1" w:name="_Toc242536658"/>
       <w:r>
         <w:rPr>
           <w:rFonts w:ascii="Times New Roman" w:eastAsia="新細明體" w:hAnsi="Times New Roman" w:cs="Times New Roman"/>
@@ -8751,7 +8733,7 @@
       <w:pPr>
         <w:pStyle w:val="1"/>
       </w:pPr>
-      <w:bookmarkStart w:id="2" w:name="_Toc242536593"/>
+      <w:bookmarkStart w:id="2" w:name="_Toc242536659"/>
       <w:r>
         <w:rPr>
           <w:rFonts w:ascii="Times New Roman" w:eastAsia="新細明體" w:hAnsi="Times New Roman" w:cs="Times New Roman"/>
@@ -8782,7 +8764,7 @@
       <w:pPr>
         <w:pStyle w:val="21"/>
       </w:pPr>
-      <w:bookmarkStart w:id="3" w:name="_Toc242536594"/>
+      <w:bookmarkStart w:id="3" w:name="_Toc242536660"/>
       <w:r>
         <w:rPr>
           <w:rFonts w:ascii="Times New Roman" w:eastAsia="新細明體" w:hAnsi="Times New Roman" w:cs="Times New Roman"/>
@@ -9990,7 +9972,7 @@
           <w:noProof/>
         </w:rPr>
         <w:drawing>
-          <wp:inline distT="0" distB="0" distL="0" distR="0" wp14:anchorId="6FF405A3" wp14:editId="7F8942C2">
+          <wp:inline distT="0" distB="0" distL="0" distR="0" wp14:anchorId="0B29309C" wp14:editId="463A81E6">
             <wp:extent cx="5724000" cy="3982406"/>
             <wp:effectExtent l="0" t="0" r="0" b="0"/>
             <wp:docPr id="1" name="Picture 1"/>
@@ -10159,7 +10141,7 @@
       <w:pPr>
         <w:pStyle w:val="21"/>
       </w:pPr>
-      <w:bookmarkStart w:id="4" w:name="_Toc242536595"/>
+      <w:bookmarkStart w:id="4" w:name="_Toc242536661"/>
       <w:r>
         <w:rPr>
           <w:rFonts w:ascii="Times New Roman" w:eastAsia="新細明體" w:hAnsi="Times New Roman" w:cs="Times New Roman"/>
@@ -14064,7 +14046,7 @@
       <w:pPr>
         <w:pStyle w:val="21"/>
       </w:pPr>
-      <w:bookmarkStart w:id="5" w:name="_Toc242536596"/>
+      <w:bookmarkStart w:id="5" w:name="_Toc242536662"/>
       <w:r>
         <w:rPr>
           <w:rFonts w:ascii="Times New Roman" w:eastAsia="新細明體" w:hAnsi="Times New Roman" w:cs="Times New Roman"/>
@@ -14159,7 +14141,7 @@
         </w:rPr>
         <w:lastRenderedPageBreak/>
         <w:drawing>
-          <wp:inline distT="0" distB="0" distL="0" distR="0" wp14:anchorId="4FD3191E" wp14:editId="70776B7D">
+          <wp:inline distT="0" distB="0" distL="0" distR="0" wp14:anchorId="4D963B5B" wp14:editId="176FF3FE">
             <wp:extent cx="5724000" cy="3169773"/>
             <wp:effectExtent l="0" t="0" r="0" b="0"/>
             <wp:docPr id="2" name="Picture 2"/>
@@ -14316,7 +14298,7 @@
       <w:pPr>
         <w:pStyle w:val="21"/>
       </w:pPr>
-      <w:bookmarkStart w:id="6" w:name="_Toc242536597"/>
+      <w:bookmarkStart w:id="6" w:name="_Toc242536663"/>
       <w:r>
         <w:rPr>
           <w:rFonts w:ascii="Times New Roman" w:eastAsia="新細明體" w:hAnsi="Times New Roman" w:cs="Times New Roman"/>
@@ -14423,7 +14405,7 @@
         </w:rPr>
         <w:lastRenderedPageBreak/>
         <w:drawing>
-          <wp:inline distT="0" distB="0" distL="0" distR="0" wp14:anchorId="30638137" wp14:editId="7460D68C">
+          <wp:inline distT="0" distB="0" distL="0" distR="0" wp14:anchorId="3CF01A43" wp14:editId="622C3EA6">
             <wp:extent cx="5256000" cy="6815949"/>
             <wp:effectExtent l="0" t="0" r="0" b="0"/>
             <wp:docPr id="3" name="Picture 3"/>
@@ -14782,7 +14764,7 @@
           <w:noProof/>
         </w:rPr>
         <w:drawing>
-          <wp:inline distT="0" distB="0" distL="0" distR="0" wp14:anchorId="4213A235" wp14:editId="0642B415">
+          <wp:inline distT="0" distB="0" distL="0" distR="0" wp14:anchorId="566C5CFD" wp14:editId="16384B53">
             <wp:extent cx="5724000" cy="3562609"/>
             <wp:effectExtent l="0" t="0" r="0" b="0"/>
             <wp:docPr id="4" name="Picture 4"/>
@@ -14927,7 +14909,7 @@
       <w:pPr>
         <w:pStyle w:val="21"/>
       </w:pPr>
-      <w:bookmarkStart w:id="7" w:name="_Toc242536598"/>
+      <w:bookmarkStart w:id="7" w:name="_Toc242536664"/>
       <w:r>
         <w:rPr>
           <w:rFonts w:ascii="Times New Roman" w:eastAsia="新細明體" w:hAnsi="Times New Roman" w:cs="Times New Roman"/>
@@ -15070,7 +15052,7 @@
         </w:rPr>
         <w:lastRenderedPageBreak/>
         <w:drawing>
-          <wp:inline distT="0" distB="0" distL="0" distR="0" wp14:anchorId="48034186" wp14:editId="3FF59EDA">
+          <wp:inline distT="0" distB="0" distL="0" distR="0" wp14:anchorId="08AE7AD5" wp14:editId="28AB0264">
             <wp:extent cx="5256000" cy="4957571"/>
             <wp:effectExtent l="0" t="0" r="0" b="0"/>
             <wp:docPr id="5" name="Picture 5"/>
@@ -16287,7 +16269,7 @@
       <w:pPr>
         <w:pStyle w:val="21"/>
       </w:pPr>
-      <w:bookmarkStart w:id="8" w:name="_Toc242536599"/>
+      <w:bookmarkStart w:id="8" w:name="_Toc242536665"/>
       <w:r>
         <w:rPr>
           <w:rFonts w:ascii="Times New Roman" w:eastAsia="新細明體" w:hAnsi="Times New Roman" w:cs="Times New Roman"/>
@@ -16399,7 +16381,7 @@
           <w:noProof/>
         </w:rPr>
         <w:drawing>
-          <wp:inline distT="0" distB="0" distL="0" distR="0" wp14:anchorId="4CDBDD9F" wp14:editId="29D20118">
+          <wp:inline distT="0" distB="0" distL="0" distR="0" wp14:anchorId="438774F8" wp14:editId="3E9F223D">
             <wp:extent cx="5328000" cy="5631878"/>
             <wp:effectExtent l="0" t="0" r="0" b="0"/>
             <wp:docPr id="6" name="Picture 6"/>
@@ -16532,7 +16514,7 @@
       <w:pPr>
         <w:pStyle w:val="21"/>
       </w:pPr>
-      <w:bookmarkStart w:id="9" w:name="_Toc242536600"/>
+      <w:bookmarkStart w:id="9" w:name="_Toc242536666"/>
       <w:r>
         <w:rPr>
           <w:rFonts w:ascii="Times New Roman" w:eastAsia="新細明體" w:hAnsi="Times New Roman" w:cs="Times New Roman"/>
@@ -16584,7 +16566,7 @@
       <w:pPr>
         <w:pStyle w:val="1"/>
       </w:pPr>
-      <w:bookmarkStart w:id="10" w:name="_Toc242536601"/>
+      <w:bookmarkStart w:id="10" w:name="_Toc242536667"/>
       <w:r>
         <w:rPr>
           <w:rFonts w:ascii="Times New Roman" w:eastAsia="新細明體" w:hAnsi="Times New Roman" w:cs="Times New Roman"/>
@@ -19084,7 +19066,7 @@
       <w:pPr>
         <w:pStyle w:val="1"/>
       </w:pPr>
-      <w:bookmarkStart w:id="11" w:name="_Toc242536602"/>
+      <w:bookmarkStart w:id="11" w:name="_Toc242536668"/>
       <w:r>
         <w:rPr>
           <w:rFonts w:ascii="Times New Roman" w:eastAsia="新細明體" w:hAnsi="Times New Roman" w:cs="Times New Roman"/>
@@ -19392,7 +19374,7 @@
       <w:pPr>
         <w:pStyle w:val="21"/>
       </w:pPr>
-      <w:bookmarkStart w:id="12" w:name="_Toc242536603"/>
+      <w:bookmarkStart w:id="12" w:name="_Toc242536669"/>
       <w:r>
         <w:rPr>
           <w:rFonts w:ascii="Times New Roman" w:eastAsia="新細明體" w:hAnsi="Times New Roman" w:cs="Times New Roman"/>
@@ -19425,7 +19407,7 @@
       <w:pPr>
         <w:pStyle w:val="21"/>
       </w:pPr>
-      <w:bookmarkStart w:id="13" w:name="_Toc242536604"/>
+      <w:bookmarkStart w:id="13" w:name="_Toc242536670"/>
       <w:r>
         <w:rPr>
           <w:rFonts w:ascii="Times New Roman" w:eastAsia="新細明體" w:hAnsi="Times New Roman" w:cs="Times New Roman"/>
@@ -19688,7 +19670,7 @@
       <w:pPr>
         <w:pStyle w:val="21"/>
       </w:pPr>
-      <w:bookmarkStart w:id="14" w:name="_Toc242536605"/>
+      <w:bookmarkStart w:id="14" w:name="_Toc242536671"/>
       <w:r>
         <w:rPr>
           <w:rFonts w:ascii="Times New Roman" w:eastAsia="新細明體" w:hAnsi="Times New Roman" w:cs="Times New Roman"/>
@@ -20995,7 +20977,7 @@
       <w:pPr>
         <w:pStyle w:val="1"/>
       </w:pPr>
-      <w:bookmarkStart w:id="15" w:name="_Toc242536606"/>
+      <w:bookmarkStart w:id="15" w:name="_Toc242536672"/>
       <w:r>
         <w:rPr>
           <w:rFonts w:ascii="Times New Roman" w:eastAsia="新細明體" w:hAnsi="Times New Roman" w:cs="Times New Roman"/>
@@ -21720,7 +21702,7 @@
         <w:pStyle w:val="1"/>
         <w:pageBreakBefore/>
       </w:pPr>
-      <w:bookmarkStart w:id="16" w:name="_Toc242536607"/>
+      <w:bookmarkStart w:id="16" w:name="_Toc242536673"/>
       <w:r>
         <w:rPr>
           <w:rFonts w:ascii="Times New Roman" w:eastAsia="新細明體" w:hAnsi="Times New Roman" w:cs="Times New Roman"/>
@@ -21849,7 +21831,7 @@
         <w:pStyle w:val="1"/>
         <w:pageBreakBefore/>
       </w:pPr>
-      <w:bookmarkStart w:id="17" w:name="_Toc242536608"/>
+      <w:bookmarkStart w:id="17" w:name="_Toc242536674"/>
       <w:r>
         <w:rPr>
           <w:rFonts w:ascii="Times New Roman" w:eastAsia="新細明體" w:hAnsi="Times New Roman" w:cs="Times New Roman"/>
@@ -23531,7 +23513,7 @@
       <w:pPr>
         <w:pStyle w:val="1"/>
       </w:pPr>
-      <w:bookmarkStart w:id="18" w:name="_Toc242536609"/>
+      <w:bookmarkStart w:id="18" w:name="_Toc242536675"/>
       <w:r>
         <w:rPr>
           <w:rFonts w:ascii="Times New Roman" w:eastAsia="新細明體" w:hAnsi="Times New Roman" w:cs="Times New Roman"/>
@@ -23564,7 +23546,7 @@
           <w:noProof/>
         </w:rPr>
         <w:drawing>
-          <wp:inline distT="0" distB="0" distL="0" distR="0" wp14:anchorId="7880B182" wp14:editId="7C26C67A">
+          <wp:inline distT="0" distB="0" distL="0" distR="0" wp14:anchorId="79F15752" wp14:editId="3AAFEAD6">
             <wp:extent cx="5364000" cy="4024521"/>
             <wp:effectExtent l="0" t="0" r="0" b="0"/>
             <wp:docPr id="7" name="Picture 7"/>
@@ -23669,7 +23651,7 @@
         </w:rPr>
         <w:lastRenderedPageBreak/>
         <w:drawing>
-          <wp:inline distT="0" distB="0" distL="0" distR="0" wp14:anchorId="76993911" wp14:editId="6F2F4007">
+          <wp:inline distT="0" distB="0" distL="0" distR="0" wp14:anchorId="09D0EBF0" wp14:editId="2EF801A6">
             <wp:extent cx="5616000" cy="4438158"/>
             <wp:effectExtent l="0" t="0" r="0" b="0"/>
             <wp:docPr id="8" name="Picture 8"/>
@@ -23882,7 +23864,7 @@
         </w:rPr>
         <w:lastRenderedPageBreak/>
         <w:drawing>
-          <wp:inline distT="0" distB="0" distL="0" distR="0" wp14:anchorId="02B83A51" wp14:editId="70A1ECF2">
+          <wp:inline distT="0" distB="0" distL="0" distR="0" wp14:anchorId="7B63FE44" wp14:editId="461E630D">
             <wp:extent cx="5724000" cy="3951291"/>
             <wp:effectExtent l="0" t="0" r="0" b="0"/>
             <wp:docPr id="9" name="Picture 9"/>
@@ -24347,31 +24329,31 @@
       </w:rPr>
     </w:lvl>
   </w:abstractNum>
-  <w:num w:numId="1" w16cid:durableId="614749533">
+  <w:num w:numId="1" w16cid:durableId="786201233">
     <w:abstractNumId w:val="8"/>
   </w:num>
-  <w:num w:numId="2" w16cid:durableId="1494644842">
+  <w:num w:numId="2" w16cid:durableId="1408382368">
     <w:abstractNumId w:val="6"/>
   </w:num>
-  <w:num w:numId="3" w16cid:durableId="1434324432">
+  <w:num w:numId="3" w16cid:durableId="678239990">
     <w:abstractNumId w:val="5"/>
   </w:num>
-  <w:num w:numId="4" w16cid:durableId="1223560623">
+  <w:num w:numId="4" w16cid:durableId="766271746">
     <w:abstractNumId w:val="4"/>
   </w:num>
-  <w:num w:numId="5" w16cid:durableId="1089935104">
+  <w:num w:numId="5" w16cid:durableId="1552228707">
     <w:abstractNumId w:val="7"/>
   </w:num>
-  <w:num w:numId="6" w16cid:durableId="1662151123">
+  <w:num w:numId="6" w16cid:durableId="1914392076">
     <w:abstractNumId w:val="3"/>
   </w:num>
-  <w:num w:numId="7" w16cid:durableId="150097837">
+  <w:num w:numId="7" w16cid:durableId="1773820067">
     <w:abstractNumId w:val="2"/>
   </w:num>
-  <w:num w:numId="8" w16cid:durableId="1137524933">
+  <w:num w:numId="8" w16cid:durableId="1975139552">
     <w:abstractNumId w:val="1"/>
   </w:num>
-  <w:num w:numId="9" w16cid:durableId="168256256">
+  <w:num w:numId="9" w16cid:durableId="1213539173">
     <w:abstractNumId w:val="0"/>
   </w:num>
 </w:numbering>
@@ -35769,7 +35751,7 @@
     <w:autoRedefine/>
     <w:uiPriority w:val="39"/>
     <w:unhideWhenUsed/>
-    <w:rsid w:val="00C1076B"/>
+    <w:rsid w:val="004809EB"/>
   </w:style>
   <w:style w:type="paragraph" w:styleId="2a">
     <w:name w:val="toc 2"/>
@@ -35778,7 +35760,7 @@
     <w:autoRedefine/>
     <w:uiPriority w:val="39"/>
     <w:unhideWhenUsed/>
-    <w:rsid w:val="00C1076B"/>
+    <w:rsid w:val="004809EB"/>
     <w:pPr>
       <w:ind w:leftChars="200" w:left="480"/>
     </w:pPr>
@@ -35788,7 +35770,7 @@
     <w:basedOn w:val="a2"/>
     <w:uiPriority w:val="99"/>
     <w:unhideWhenUsed/>
-    <w:rsid w:val="00C1076B"/>
+    <w:rsid w:val="004809EB"/>
     <w:rPr>
       <w:color w:val="0000FF" w:themeColor="hyperlink"/>
       <w:u w:val="single"/>

</xml_diff>